<commit_message>
Make round return a number, and drop a dead comparison in the tag scanner
round was the one arithmetic formatter returning a string, so {price|round:2} landed
in a spreadsheet as text and the SUM over its column silently returned zero. It now
returns a number like sum, add and multiply do; currency and number still return
formatted text, which is the documented distinction.

131 tests pass.

Co-Authored-By: Claude Opus 5 (1M context) <noreply@anthropic.com>
Claude-Session: https://claude.ai/code/session_018KEKXsLNnUHdwnAGmnMsHj
</commit_message>
<xml_diff>
--- a/examples/invoice.docx
+++ b/examples/invoice.docx
@@ -158,7 +158,7 @@
           <w:top w:val="single" w:sz="12" w:space="0" w:color="12395B"/>
         </w:pBdr>
         <w:bidi w:val="0"/>
-        <w:spacing w:before="255" w:after="238"/>
+        <w:spacing w:before="215" w:after="193"/>
         <w:jc w:val="left"/>
         <w:rPr>
           <w:sz w:val="2"/>
@@ -181,7 +181,7 @@
           <w:b/>
           <w:color w:val="12395B"/>
           <w:spacing w:val="23"/>
-          <w:sz w:val="48"/>
+          <w:sz w:val="44"/>
         </w:rPr>
       </w:pPr>
       <w:r>
@@ -190,7 +190,7 @@
           <w:b/>
           <w:color w:val="12395B"/>
           <w:spacing w:val="23"/>
-          <w:sz w:val="48"/>
+          <w:sz w:val="44"/>
         </w:rPr>
         <w:t>INVOICE</w:t>
       </w:r>
@@ -211,6 +211,22 @@
           <w:sz w:val="18"/>
         </w:rPr>
         <w:t>{items|count} line items · issued {issued|date:DD MMMM YYYY}</w:t>
+      </w:r>
+    </w:p>
+    <w:p>
+      <w:pPr>
+        <w:pStyle w:val="Normal"/>
+        <w:bidi w:val="0"/>
+        <w:spacing w:lineRule="auto" w:line="240" w:before="0" w:after="0"/>
+        <w:jc w:val="left"/>
+        <w:rPr>
+          <w:sz w:val="18"/>
+        </w:rPr>
+      </w:pPr>
+      <w:r>
+        <w:rPr>
+          <w:sz w:val="18"/>
+        </w:rPr>
       </w:r>
     </w:p>
     <w:tbl>
@@ -791,12 +807,12 @@
         <w:spacing w:lineRule="auto" w:line="240" w:before="0" w:after="0"/>
         <w:jc w:val="left"/>
         <w:rPr>
-          <w:sz w:val="22"/>
+          <w:sz w:val="18"/>
         </w:rPr>
       </w:pPr>
       <w:r>
         <w:rPr>
-          <w:sz w:val="22"/>
+          <w:sz w:val="18"/>
         </w:rPr>
       </w:r>
     </w:p>
@@ -1046,8 +1062,8 @@
               <w:bottom w:val="single" w:sz="4" w:space="0" w:color="DCE3EA"/>
             </w:tcBorders>
             <w:tcMar>
-              <w:top w:w="85" w:type="dxa"/>
-              <w:bottom w:w="85" w:type="dxa"/>
+              <w:top w:w="74" w:type="dxa"/>
+              <w:bottom w:w="74" w:type="dxa"/>
             </w:tcMar>
           </w:tcPr>
           <w:p>
@@ -1076,9 +1092,9 @@
               <w:bottom w:val="single" w:sz="4" w:space="0" w:color="DCE3EA"/>
             </w:tcBorders>
             <w:tcMar>
-              <w:top w:w="85" w:type="dxa"/>
+              <w:top w:w="74" w:type="dxa"/>
               <w:left w:w="57" w:type="dxa"/>
-              <w:bottom w:w="85" w:type="dxa"/>
+              <w:bottom w:w="74" w:type="dxa"/>
             </w:tcMar>
           </w:tcPr>
           <w:p>
@@ -1128,9 +1144,9 @@
               <w:bottom w:val="single" w:sz="4" w:space="0" w:color="DCE3EA"/>
             </w:tcBorders>
             <w:tcMar>
-              <w:top w:w="85" w:type="dxa"/>
+              <w:top w:w="74" w:type="dxa"/>
               <w:left w:w="57" w:type="dxa"/>
-              <w:bottom w:w="85" w:type="dxa"/>
+              <w:bottom w:w="74" w:type="dxa"/>
             </w:tcMar>
           </w:tcPr>
           <w:p>
@@ -1157,9 +1173,9 @@
               <w:bottom w:val="single" w:sz="4" w:space="0" w:color="DCE3EA"/>
             </w:tcBorders>
             <w:tcMar>
-              <w:top w:w="85" w:type="dxa"/>
+              <w:top w:w="74" w:type="dxa"/>
               <w:left w:w="57" w:type="dxa"/>
-              <w:bottom w:w="85" w:type="dxa"/>
+              <w:bottom w:w="74" w:type="dxa"/>
             </w:tcMar>
           </w:tcPr>
           <w:p>
@@ -1188,9 +1204,9 @@
               <w:bottom w:val="single" w:sz="4" w:space="0" w:color="DCE3EA"/>
             </w:tcBorders>
             <w:tcMar>
-              <w:top w:w="85" w:type="dxa"/>
+              <w:top w:w="74" w:type="dxa"/>
               <w:left w:w="57" w:type="dxa"/>
-              <w:bottom w:w="85" w:type="dxa"/>
+              <w:bottom w:w="74" w:type="dxa"/>
             </w:tcMar>
           </w:tcPr>
           <w:p>
@@ -1217,9 +1233,9 @@
               <w:bottom w:val="single" w:sz="4" w:space="0" w:color="DCE3EA"/>
             </w:tcBorders>
             <w:tcMar>
-              <w:top w:w="85" w:type="dxa"/>
+              <w:top w:w="74" w:type="dxa"/>
               <w:left w:w="57" w:type="dxa"/>
-              <w:bottom w:w="85" w:type="dxa"/>
+              <w:bottom w:w="74" w:type="dxa"/>
               <w:right w:w="125" w:type="dxa"/>
             </w:tcMar>
           </w:tcPr>
@@ -1277,12 +1293,16 @@
             <w:pPr>
               <w:pStyle w:val="Normal"/>
               <w:bidi w:val="0"/>
-              <w:spacing w:lineRule="auto" w:line="276" w:before="0" w:after="0"/>
-              <w:jc w:val="left"/>
-              <w:rPr/>
-            </w:pPr>
-            <w:r>
-              <w:rPr/>
+              <w:spacing w:lineRule="auto" w:line="240" w:before="0" w:after="0"/>
+              <w:jc w:val="left"/>
+              <w:rPr>
+                <w:sz w:val="14"/>
+              </w:rPr>
+            </w:pPr>
+            <w:r>
+              <w:rPr>
+                <w:sz w:val="14"/>
+              </w:rPr>
             </w:r>
           </w:p>
         </w:tc>
@@ -1291,9 +1311,9 @@
             <w:tcW w:w="2268" w:type="dxa"/>
             <w:tcBorders/>
             <w:tcMar>
-              <w:top w:w="57" w:type="dxa"/>
+              <w:top w:w="40" w:type="dxa"/>
               <w:left w:w="57" w:type="dxa"/>
-              <w:bottom w:w="57" w:type="dxa"/>
+              <w:bottom w:w="40" w:type="dxa"/>
               <w:right w:w="125" w:type="dxa"/>
             </w:tcMar>
             <w:vAlign w:val="center"/>
@@ -1322,9 +1342,9 @@
             <w:tcW w:w="1985" w:type="dxa"/>
             <w:tcBorders/>
             <w:tcMar>
-              <w:top w:w="57" w:type="dxa"/>
+              <w:top w:w="40" w:type="dxa"/>
               <w:left w:w="57" w:type="dxa"/>
-              <w:bottom w:w="57" w:type="dxa"/>
+              <w:bottom w:w="40" w:type="dxa"/>
               <w:right w:w="125" w:type="dxa"/>
             </w:tcMar>
             <w:vAlign w:val="center"/>
@@ -1362,12 +1382,16 @@
             <w:pPr>
               <w:pStyle w:val="Normal"/>
               <w:bidi w:val="0"/>
-              <w:spacing w:lineRule="auto" w:line="276" w:before="0" w:after="0"/>
-              <w:jc w:val="left"/>
-              <w:rPr/>
-            </w:pPr>
-            <w:r>
-              <w:rPr/>
+              <w:spacing w:lineRule="auto" w:line="240" w:before="0" w:after="0"/>
+              <w:jc w:val="left"/>
+              <w:rPr>
+                <w:sz w:val="14"/>
+              </w:rPr>
+            </w:pPr>
+            <w:r>
+              <w:rPr>
+                <w:sz w:val="14"/>
+              </w:rPr>
             </w:r>
           </w:p>
         </w:tc>
@@ -1376,9 +1400,9 @@
             <w:tcW w:w="2268" w:type="dxa"/>
             <w:tcBorders/>
             <w:tcMar>
-              <w:top w:w="57" w:type="dxa"/>
+              <w:top w:w="40" w:type="dxa"/>
               <w:left w:w="57" w:type="dxa"/>
-              <w:bottom w:w="57" w:type="dxa"/>
+              <w:bottom w:w="40" w:type="dxa"/>
               <w:right w:w="125" w:type="dxa"/>
             </w:tcMar>
             <w:vAlign w:val="center"/>
@@ -1407,9 +1431,9 @@
             <w:tcW w:w="1985" w:type="dxa"/>
             <w:tcBorders/>
             <w:tcMar>
-              <w:top w:w="57" w:type="dxa"/>
+              <w:top w:w="40" w:type="dxa"/>
               <w:left w:w="57" w:type="dxa"/>
-              <w:bottom w:w="57" w:type="dxa"/>
+              <w:bottom w:w="40" w:type="dxa"/>
               <w:right w:w="125" w:type="dxa"/>
             </w:tcMar>
             <w:vAlign w:val="center"/>
@@ -1447,12 +1471,16 @@
             <w:pPr>
               <w:pStyle w:val="Normal"/>
               <w:bidi w:val="0"/>
-              <w:spacing w:lineRule="auto" w:line="276" w:before="0" w:after="0"/>
-              <w:jc w:val="left"/>
-              <w:rPr/>
-            </w:pPr>
-            <w:r>
-              <w:rPr/>
+              <w:spacing w:lineRule="auto" w:line="240" w:before="0" w:after="0"/>
+              <w:jc w:val="left"/>
+              <w:rPr>
+                <w:sz w:val="14"/>
+              </w:rPr>
+            </w:pPr>
+            <w:r>
+              <w:rPr>
+                <w:sz w:val="14"/>
+              </w:rPr>
             </w:r>
           </w:p>
         </w:tc>
@@ -1464,9 +1492,9 @@
             </w:tcBorders>
             <w:shd w:fill="EEF3F8" w:val="clear"/>
             <w:tcMar>
-              <w:top w:w="113" w:type="dxa"/>
+              <w:top w:w="91" w:type="dxa"/>
               <w:left w:w="57" w:type="dxa"/>
-              <w:bottom w:w="113" w:type="dxa"/>
+              <w:bottom w:w="91" w:type="dxa"/>
               <w:right w:w="125" w:type="dxa"/>
             </w:tcMar>
             <w:vAlign w:val="center"/>
@@ -1504,9 +1532,9 @@
             </w:tcBorders>
             <w:shd w:fill="EEF3F8" w:val="clear"/>
             <w:tcMar>
-              <w:top w:w="113" w:type="dxa"/>
+              <w:top w:w="91" w:type="dxa"/>
               <w:left w:w="57" w:type="dxa"/>
-              <w:bottom w:w="113" w:type="dxa"/>
+              <w:bottom w:w="91" w:type="dxa"/>
               <w:right w:w="125" w:type="dxa"/>
             </w:tcMar>
             <w:vAlign w:val="center"/>
@@ -1934,7 +1962,7 @@
       <w:pPr>
         <w:pStyle w:val="Normal"/>
         <w:bidi w:val="0"/>
-        <w:spacing w:lineRule="auto" w:line="292" w:before="255" w:after="0"/>
+        <w:spacing w:lineRule="auto" w:line="292" w:before="227" w:after="0"/>
         <w:jc w:val="left"/>
         <w:rPr>
           <w:color w:val="6B7B8B"/>
@@ -1954,7 +1982,7 @@
       <w:footerReference w:type="default" r:id="rId3"/>
       <w:type w:val="nextPage"/>
       <w:pgSz w:w="11906" w:h="16838"/>
-      <w:pgMar w:left="1134" w:right="1134" w:gutter="0" w:header="850" w:top="1463" w:footer="850" w:bottom="1451"/>
+      <w:pgMar w:left="1134" w:right="1134" w:gutter="0" w:header="737" w:top="1350" w:footer="737" w:bottom="1338"/>
       <w:pgNumType w:fmt="decimal"/>
       <w:formProt w:val="false"/>
       <w:textDirection w:val="lrTb"/>

</xml_diff>